<commit_message>
Add durable eight-hour outreach pacing
</commit_message>
<xml_diff>
--- a/docs/ARCHITECTURE_CHANGES.docx
+++ b/docs/ARCHITECTURE_CHANGES.docx
@@ -471,7 +471,7 @@
           <w:color w:val="1F2937"/>
           <w:sz w:val="22"/>
         </w:rPr>
-        <w:t>Google Workspace Gmail API and Zoho are supported through HTTP(S) only. PostgreSQL enforces 40 attempts per account, rotation, a 24-hour cooldown, leases, immutable recipient attribution, and global and per-account sequences. Ambiguous sends fail closed instead of being retried blindly.</w:t>
+        <w:t>Google Workspace Gmail API and Zoho use HTTP(S) only. PostgreSQL limits each account to 40 attempts paced through durable slots across eight hours, with persisted 2-5 minute jitter and a global velocity gate, followed by rotation and a 24-hour cooldown. Each job activation makes at most one provider call; ambiguous sends fail closed.</w:t>
       </w:r>
     </w:p>
     <w:p>
@@ -567,7 +567,7 @@
           <w:color w:val="1F2937"/>
           <w:sz w:val="21"/>
         </w:rPr>
-        <w:t>The architecture is deployed and the Places, Apollo, optional SerpAPI, and Hugging Face credentials are stored in protected env files. Email and OCR remain disabled, Google Workspace mailbox OAuth credentials are not configured, and no Melbourne scrape, OCR run, or real email send was triggered during this update.</w:t>
+        <w:t>The core architecture and migrations 1-23 are deployed. Provider credentials remain in protected env files, while email and OCR stay disabled and Google Workspace mailbox OAuth is not configured. The eight-hour pacing code and migration 24 remain undeployed; no Melbourne scrape, OCR run, or real email send was triggered.</w:t>
       </w:r>
     </w:p>
     <w:p>

</xml_diff>